<commit_message>
Update Activity Monitoring (MN-INACTIVE) to v1.1
Post-interview improvements:
- Configurable escalation multiplier system variable (default 2x),
  replacing hardcoded 2x thresholds (REQ-010)
- Two configurable notification templates for Dormant and Inactive
  stages with stage name and Engagement link (REQ-011)
- Engagement Health dashboard showing pipeline status counts,
  accessible to Client Admin, Mentor Admin, and Executive Member
  (REQ-012)
- Added Executive Member (MST-PER-002) to Personas Involved
- Updated workflow steps and requirement language throughout to
  reference configurable multiplier
</commit_message>
<xml_diff>
--- a/PRDs/MN/MN-INACTIVE.docx
+++ b/PRDs/MN/MN-INACTIVE.docx
@@ -264,7 +264,7 @@
                 <w:sz w:val="20"/>
                 <w:szCs w:val="20"/>
               </w:rPr>
-              <w:t xml:space="preserve">1.0</w:t>
+              <w:t xml:space="preserve">1.1</w:t>
             </w:r>
           </w:p>
         </w:tc>
@@ -394,7 +394,7 @@
                 <w:sz w:val="20"/>
                 <w:szCs w:val="20"/>
               </w:rPr>
-              <w:t xml:space="preserve">03-31-26 23:30</w:t>
+              <w:t xml:space="preserve">04-01-26 00:15</w:t>
             </w:r>
           </w:p>
         </w:tc>
@@ -958,7 +958,41 @@
           <w:sz w:val="22"/>
           <w:szCs w:val="22"/>
         </w:rPr>
-        <w:t xml:space="preserve">Has access to filtered views showing all Dormant and Inactive engagements for trend monitoring across mentors. Does not receive automated notifications from this process. Their involvement is triggered by patterns observed in the data or by escalation from the Client Administrator.</w:t>
+        <w:t xml:space="preserve">Has access to filtered views and the Engagement Health dashboard showing all Dormant and Inactive engagements for trend monitoring across mentors. Does not receive automated notifications from this process. Their involvement is triggered by patterns observed in the data or by escalation from the Client Administrator.</w:t>
+      </w:r>
+    </w:p>
+    <w:p>
+      <w:pPr>
+        <w:spacing w:after="40"/>
+      </w:pPr>
+      <w:r>
+        <w:rPr>
+          <w:rFonts w:ascii="Arial" w:cs="Arial" w:eastAsia="Arial" w:hAnsi="Arial"/>
+          <w:b/>
+          <w:bCs/>
+          <w:i w:val="false"/>
+          <w:iCs w:val="false"/>
+          <w:sz w:val="22"/>
+          <w:szCs w:val="22"/>
+        </w:rPr>
+        <w:t xml:space="preserve">Executive Member (MST-PER-002)</w:t>
+      </w:r>
+    </w:p>
+    <w:p>
+      <w:pPr>
+        <w:spacing w:after="120"/>
+      </w:pPr>
+      <w:r>
+        <w:rPr>
+          <w:rFonts w:ascii="Arial" w:cs="Arial" w:eastAsia="Arial" w:hAnsi="Arial"/>
+          <w:b w:val="false"/>
+          <w:bCs w:val="false"/>
+          <w:i w:val="false"/>
+          <w:iCs w:val="false"/>
+          <w:sz w:val="22"/>
+          <w:szCs w:val="22"/>
+        </w:rPr>
+        <w:t xml:space="preserve">Has access to the Engagement Health dashboard for organizational health monitoring. Views aggregate engagement pipeline status counts to understand program health at a glance. Does not receive automated notifications and does not participate in individual engagement interventions.</w:t>
       </w:r>
     </w:p>
     <w:p>
@@ -1020,7 +1054,7 @@
           <w:sz w:val="22"/>
           <w:szCs w:val="22"/>
         </w:rPr>
-        <w:t xml:space="preserve">For Active engagements, the system compares today’s date against the Engagement’s Next Session Date/Time using the Meeting Cadence as the base period (Weekly = 7 days, Bi-Weekly = 14 days, Monthly = 30 days, As Needed = configurable system default in days). For On-Hold engagements, the system compares today’s date against the Hold End Date using the same cadence-based calculation.</w:t>
+        <w:t xml:space="preserve">For Active engagements, the system compares today’s date against the Engagement’s Next Session Date/Time using the Meeting Cadence as the base period (Weekly = 7 days, Bi-Weekly = 14 days, Monthly = 30 days, As Needed = configurable system default in days). For On-Hold engagements, the system compares today’s date against the Hold End Date using the same cadence-based calculation. The escalation multiplier is a configurable system variable (default: 2x).</w:t>
       </w:r>
     </w:p>
     <w:p>
@@ -1042,7 +1076,7 @@
           <w:sz w:val="22"/>
           <w:szCs w:val="22"/>
         </w:rPr>
-        <w:t xml:space="preserve">If the elapsed time exceeds 2x the cadence period, the system transitions the Engagement status to Dormant and sends a notification to the Assigned Mentor and Client Administrator. The notification identifies the client (business name and contact name) and includes a direct link to the Engagement record.</w:t>
+        <w:t xml:space="preserve">If the elapsed time exceeds 1x the escalation multiplier times the cadence period (default: 2x cadence), the system transitions the Engagement status to Dormant and sends a notification using the Dormant notification template to the Assigned Mentor and Client Administrator. The notification identifies the stage (Dormant) and includes a direct link to the Engagement record.</w:t>
       </w:r>
     </w:p>
     <w:p>
@@ -1064,7 +1098,7 @@
           <w:sz w:val="22"/>
           <w:szCs w:val="22"/>
         </w:rPr>
-        <w:t xml:space="preserve">If the elapsed time exceeds 4x the cadence period, the system transitions the Engagement status from Dormant to Inactive and sends a notification to the Assigned Mentor and Client Administrator with the same content as the Dormant notification.</w:t>
+        <w:t xml:space="preserve">If the elapsed time exceeds 2x the escalation multiplier times the cadence period (default: 4x cadence), the system transitions the Engagement status from Dormant to Inactive and sends a notification using the Inactive notification template to the Assigned Mentor and Client Administrator. The notification identifies the stage (Inactive) and includes a direct link to the Engagement record.</w:t>
       </w:r>
     </w:p>
     <w:p>
@@ -1086,7 +1120,7 @@
           <w:sz w:val="22"/>
           <w:szCs w:val="22"/>
         </w:rPr>
-        <w:t xml:space="preserve">If the elapsed time exceeds 6x the cadence period, the system transitions the Engagement status from Inactive to Abandoned, populates the Close Date, and sets the Close Reason to “Inactive / No Response.” No notification is sent.</w:t>
+        <w:t xml:space="preserve">If the elapsed time exceeds 3x the escalation multiplier times the cadence period (default: 6x cadence), the system transitions the Engagement status from Inactive to Abandoned, populates the Close Date, and sets the Close Reason to “Inactive / No Response.” No notification is sent.</w:t>
       </w:r>
     </w:p>
     <w:p>
@@ -1354,7 +1388,7 @@
           <w:sz w:val="22"/>
           <w:szCs w:val="22"/>
         </w:rPr>
-        <w:t xml:space="preserve">The engagement progresses through all three escalation stages (Dormant at 2x cadence, Inactive at 4x cadence, Abandoned at 6x cadence) without qualifying activity. The system automatically sets the Engagement status to Abandoned, populates the Close Date, and sets the Close Reason to “Inactive / No Response.” The engagement is removed from the monitoring pool.</w:t>
+        <w:t xml:space="preserve">The engagement progresses through all three escalation stages (Dormant at 1x multiplier, Inactive at 2x multiplier, Abandoned at 3x multiplier, each times the cadence period) without qualifying activity. The system automatically sets the Engagement status to Abandoned, populates the Close Date, and sets the Close Reason to “Inactive / No Response.” The engagement is removed from the monitoring pool.</w:t>
       </w:r>
     </w:p>
     <w:p>
@@ -1686,7 +1720,7 @@
                 <w:sz w:val="20"/>
                 <w:szCs w:val="20"/>
               </w:rPr>
-              <w:t xml:space="preserve">The system must calculate inactivity thresholds using the Engagement’s Meeting Cadence as the base period (Weekly = 7 days, Bi-Weekly = 14 days, Monthly = 30 days, As Needed = configurable system default). For Active engagements, the calculation compares today’s date against the Next Session Date/Time. For On-Hold engagements, the calculation compares today’s date against the Hold End Date.</w:t>
+              <w:t xml:space="preserve">The system must calculate inactivity thresholds using the Engagement’s Meeting Cadence as the base period (Weekly = 7 days, Bi-Weekly = 14 days, Monthly = 30 days, As Needed = configurable system default) and a configurable escalation multiplier (default: 2x). Dormant triggers at 1x the multiplier times the cadence period, Inactive at 2x, and Abandoned at 3x. For Active engagements, the calculation compares today’s date against the Next Session Date/Time. For On-Hold engagements, the calculation compares today’s date against the Hold End Date.</w:t>
             </w:r>
           </w:p>
         </w:tc>
@@ -1750,7 +1784,7 @@
                 <w:sz w:val="20"/>
                 <w:szCs w:val="20"/>
               </w:rPr>
-              <w:t xml:space="preserve">The system must automatically transition Engagement status to Dormant and send a notification to the Assigned Mentor and Client Administrator when the elapsed time exceeds 2x the cadence period.</w:t>
+              <w:t xml:space="preserve">The system must automatically transition Engagement status to Dormant and send a notification using the configurable Dormant notification template to the Assigned Mentor and Client Administrator when the elapsed time exceeds 1x the escalation multiplier times the cadence period.</w:t>
             </w:r>
           </w:p>
         </w:tc>
@@ -1816,7 +1850,7 @@
                 <w:sz w:val="20"/>
                 <w:szCs w:val="20"/>
               </w:rPr>
-              <w:t xml:space="preserve">The system must automatically transition Engagement status from Dormant to Inactive and send a notification to the Assigned Mentor and Client Administrator when the elapsed time exceeds 4x the cadence period.</w:t>
+              <w:t xml:space="preserve">The system must automatically transition Engagement status from Dormant to Inactive and send a notification using the configurable Inactive notification template to the Assigned Mentor and Client Administrator when the elapsed time exceeds 2x the escalation multiplier times the cadence period.</w:t>
             </w:r>
           </w:p>
         </w:tc>
@@ -1880,7 +1914,7 @@
                 <w:sz w:val="20"/>
                 <w:szCs w:val="20"/>
               </w:rPr>
-              <w:t xml:space="preserve">The system must automatically transition Engagement status from Inactive to Abandoned, populate the Close Date, and set the Close Reason to “Inactive / No Response” when the elapsed time exceeds 6x the cadence period. No notification is sent.</w:t>
+              <w:t xml:space="preserve">The system must automatically transition Engagement status from Inactive to Abandoned, populate the Close Date, and set the Close Reason to “Inactive / No Response” when the elapsed time exceeds 3x the escalation multiplier times the cadence period. No notification is sent.</w:t>
             </w:r>
           </w:p>
         </w:tc>
@@ -2141,6 +2175,202 @@
                 <w:szCs w:val="20"/>
               </w:rPr>
               <w:t xml:space="preserve">The system must provide a configurable system variable that defines the default cadence period in days for engagements with a Meeting Cadence of “As Needed.”</w:t>
+            </w:r>
+          </w:p>
+        </w:tc>
+      </w:tr>
+      <w:tr>
+        <w:tc>
+          <w:tcPr>
+            <w:tcW w:type="dxa" w:w="2000"/>
+            <w:tcBorders>
+              <w:top w:val="single" w:color="AAAAAA" w:sz="1"/>
+              <w:left w:val="single" w:color="AAAAAA" w:sz="1"/>
+              <w:bottom w:val="single" w:color="AAAAAA" w:sz="1"/>
+              <w:right w:val="single" w:color="AAAAAA" w:sz="1"/>
+            </w:tcBorders>
+            <w:shd w:fill="F2F7FB" w:val="clear"/>
+            <w:tcMar>
+              <w:top w:type="dxa" w:w="60"/>
+              <w:left w:type="dxa" w:w="100"/>
+              <w:bottom w:type="dxa" w:w="60"/>
+              <w:right w:type="dxa" w:w="100"/>
+            </w:tcMar>
+          </w:tcPr>
+          <w:p>
+            <w:r>
+              <w:rPr>
+                <w:rFonts w:ascii="Arial" w:cs="Arial" w:eastAsia="Arial" w:hAnsi="Arial"/>
+                <w:b/>
+                <w:bCs/>
+                <w:i w:val="false"/>
+                <w:iCs w:val="false"/>
+                <w:sz w:val="20"/>
+                <w:szCs w:val="20"/>
+              </w:rPr>
+              <w:t xml:space="preserve">MN-INACTIVE-REQ-010</w:t>
+            </w:r>
+          </w:p>
+        </w:tc>
+        <w:tc>
+          <w:tcPr>
+            <w:tcW w:type="dxa" w:w="7360"/>
+            <w:tcBorders>
+              <w:top w:val="single" w:color="AAAAAA" w:sz="1"/>
+              <w:left w:val="single" w:color="AAAAAA" w:sz="1"/>
+              <w:bottom w:val="single" w:color="AAAAAA" w:sz="1"/>
+              <w:right w:val="single" w:color="AAAAAA" w:sz="1"/>
+            </w:tcBorders>
+            <w:shd w:fill="F2F7FB" w:val="clear"/>
+            <w:tcMar>
+              <w:top w:type="dxa" w:w="60"/>
+              <w:left w:type="dxa" w:w="100"/>
+              <w:bottom w:type="dxa" w:w="60"/>
+              <w:right w:type="dxa" w:w="100"/>
+            </w:tcMar>
+          </w:tcPr>
+          <w:p>
+            <w:r>
+              <w:rPr>
+                <w:rFonts w:ascii="Arial" w:cs="Arial" w:eastAsia="Arial" w:hAnsi="Arial"/>
+                <w:b w:val="false"/>
+                <w:bCs w:val="false"/>
+                <w:i w:val="false"/>
+                <w:iCs w:val="false"/>
+                <w:sz w:val="20"/>
+                <w:szCs w:val="20"/>
+              </w:rPr>
+              <w:t xml:space="preserve">The system must provide a configurable system variable that defines the escalation multiplier used to calculate inactivity thresholds. The default value is 2x. Changing this variable adjusts all three escalation stage thresholds proportionally.</w:t>
+            </w:r>
+          </w:p>
+        </w:tc>
+      </w:tr>
+      <w:tr>
+        <w:tc>
+          <w:tcPr>
+            <w:tcW w:type="dxa" w:w="2000"/>
+            <w:tcBorders>
+              <w:top w:val="single" w:color="AAAAAA" w:sz="1"/>
+              <w:left w:val="single" w:color="AAAAAA" w:sz="1"/>
+              <w:bottom w:val="single" w:color="AAAAAA" w:sz="1"/>
+              <w:right w:val="single" w:color="AAAAAA" w:sz="1"/>
+            </w:tcBorders>
+            <w:tcMar>
+              <w:top w:type="dxa" w:w="60"/>
+              <w:left w:type="dxa" w:w="100"/>
+              <w:bottom w:type="dxa" w:w="60"/>
+              <w:right w:type="dxa" w:w="100"/>
+            </w:tcMar>
+          </w:tcPr>
+          <w:p>
+            <w:r>
+              <w:rPr>
+                <w:rFonts w:ascii="Arial" w:cs="Arial" w:eastAsia="Arial" w:hAnsi="Arial"/>
+                <w:b/>
+                <w:bCs/>
+                <w:i w:val="false"/>
+                <w:iCs w:val="false"/>
+                <w:sz w:val="20"/>
+                <w:szCs w:val="20"/>
+              </w:rPr>
+              <w:t xml:space="preserve">MN-INACTIVE-REQ-011</w:t>
+            </w:r>
+          </w:p>
+        </w:tc>
+        <w:tc>
+          <w:tcPr>
+            <w:tcW w:type="dxa" w:w="7360"/>
+            <w:tcBorders>
+              <w:top w:val="single" w:color="AAAAAA" w:sz="1"/>
+              <w:left w:val="single" w:color="AAAAAA" w:sz="1"/>
+              <w:bottom w:val="single" w:color="AAAAAA" w:sz="1"/>
+              <w:right w:val="single" w:color="AAAAAA" w:sz="1"/>
+            </w:tcBorders>
+            <w:tcMar>
+              <w:top w:type="dxa" w:w="60"/>
+              <w:left w:type="dxa" w:w="100"/>
+              <w:bottom w:type="dxa" w:w="60"/>
+              <w:right w:type="dxa" w:w="100"/>
+            </w:tcMar>
+          </w:tcPr>
+          <w:p>
+            <w:r>
+              <w:rPr>
+                <w:rFonts w:ascii="Arial" w:cs="Arial" w:eastAsia="Arial" w:hAnsi="Arial"/>
+                <w:b w:val="false"/>
+                <w:bCs w:val="false"/>
+                <w:i w:val="false"/>
+                <w:iCs w:val="false"/>
+                <w:sz w:val="20"/>
+                <w:szCs w:val="20"/>
+              </w:rPr>
+              <w:t xml:space="preserve">The system must provide two configurable notification templates — one for the Dormant transition and one for the Inactive transition — allowing administrators to customize the message content and formatting independently. Each notification must include the notification stage name and a direct link to the Engagement record.</w:t>
+            </w:r>
+          </w:p>
+        </w:tc>
+      </w:tr>
+      <w:tr>
+        <w:tc>
+          <w:tcPr>
+            <w:tcW w:type="dxa" w:w="2000"/>
+            <w:tcBorders>
+              <w:top w:val="single" w:color="AAAAAA" w:sz="1"/>
+              <w:left w:val="single" w:color="AAAAAA" w:sz="1"/>
+              <w:bottom w:val="single" w:color="AAAAAA" w:sz="1"/>
+              <w:right w:val="single" w:color="AAAAAA" w:sz="1"/>
+            </w:tcBorders>
+            <w:shd w:fill="F2F7FB" w:val="clear"/>
+            <w:tcMar>
+              <w:top w:type="dxa" w:w="60"/>
+              <w:left w:type="dxa" w:w="100"/>
+              <w:bottom w:type="dxa" w:w="60"/>
+              <w:right w:type="dxa" w:w="100"/>
+            </w:tcMar>
+          </w:tcPr>
+          <w:p>
+            <w:r>
+              <w:rPr>
+                <w:rFonts w:ascii="Arial" w:cs="Arial" w:eastAsia="Arial" w:hAnsi="Arial"/>
+                <w:b/>
+                <w:bCs/>
+                <w:i w:val="false"/>
+                <w:iCs w:val="false"/>
+                <w:sz w:val="20"/>
+                <w:szCs w:val="20"/>
+              </w:rPr>
+              <w:t xml:space="preserve">MN-INACTIVE-REQ-012</w:t>
+            </w:r>
+          </w:p>
+        </w:tc>
+        <w:tc>
+          <w:tcPr>
+            <w:tcW w:type="dxa" w:w="7360"/>
+            <w:tcBorders>
+              <w:top w:val="single" w:color="AAAAAA" w:sz="1"/>
+              <w:left w:val="single" w:color="AAAAAA" w:sz="1"/>
+              <w:bottom w:val="single" w:color="AAAAAA" w:sz="1"/>
+              <w:right w:val="single" w:color="AAAAAA" w:sz="1"/>
+            </w:tcBorders>
+            <w:shd w:fill="F2F7FB" w:val="clear"/>
+            <w:tcMar>
+              <w:top w:type="dxa" w:w="60"/>
+              <w:left w:type="dxa" w:w="100"/>
+              <w:bottom w:type="dxa" w:w="60"/>
+              <w:right w:type="dxa" w:w="100"/>
+            </w:tcMar>
+          </w:tcPr>
+          <w:p>
+            <w:r>
+              <w:rPr>
+                <w:rFonts w:ascii="Arial" w:cs="Arial" w:eastAsia="Arial" w:hAnsi="Arial"/>
+                <w:b w:val="false"/>
+                <w:bCs w:val="false"/>
+                <w:i w:val="false"/>
+                <w:iCs w:val="false"/>
+                <w:sz w:val="20"/>
+                <w:szCs w:val="20"/>
+              </w:rPr>
+              <w:t xml:space="preserve">The system must provide an Engagement Health dashboard showing aggregate engagement counts by active pipeline status: Submitted, Pending Acceptance, Assigned, Active, On-Hold, Dormant, and Inactive. The dashboard must be accessible to the Client Administrator (MST-PER-003), Mentor Administrator (MST-PER-005), and Executive Member (MST-PER-002).</w:t>
             </w:r>
           </w:p>
         </w:tc>
@@ -5923,7 +6153,7 @@
                 <w:sz w:val="20"/>
                 <w:szCs w:val="20"/>
               </w:rPr>
-              <w:t xml:space="preserve">Updated by this process: transitions from Active or On-Hold to Dormant at 2x cadence, from Dormant to Inactive at 4x cadence, and from Inactive to Abandoned at 6x cadence. May be manually reverted from Dormant or Inactive to Active by the Assigned Mentor or Client Administrator.</w:t>
+              <w:t xml:space="preserve">Updated by this process: transitions from Active or On-Hold to Dormant at 1x the escalation multiplier times the cadence period, from Dormant to Inactive at 2x, and from Inactive to Abandoned at 3x. Default multiplier is 2x (yielding thresholds of 2x, 4x, and 6x cadence). May be manually reverted from Dormant or Inactive to Active by the Assigned Mentor or Client Administrator.</w:t>
             </w:r>
           </w:p>
         </w:tc>
@@ -7756,6 +7986,262 @@
           <w:szCs w:val="22"/>
         </w:rPr>
         <w:t xml:space="preserve">Decision: Next Session Date/Time is not required at session completion. The normal workflow naturally populates it.</w:t>
+      </w:r>
+    </w:p>
+    <w:p>
+      <w:pPr>
+        <w:pStyle w:val="Heading2"/>
+        <w:spacing w:after="120" w:before="240"/>
+      </w:pPr>
+      <w:r>
+        <w:rPr>
+          <w:rFonts w:ascii="Arial" w:cs="Arial" w:eastAsia="Arial" w:hAnsi="Arial"/>
+          <w:b/>
+          <w:bCs/>
+          <w:i w:val="false"/>
+          <w:iCs w:val="false"/>
+          <w:sz w:val="28"/>
+          <w:szCs w:val="28"/>
+        </w:rPr>
+        <w:t xml:space="preserve">Post-Interview Improvements (v1.1)</w:t>
+      </w:r>
+    </w:p>
+    <w:p>
+      <w:pPr>
+        <w:spacing w:after="120"/>
+      </w:pPr>
+      <w:r>
+        <w:rPr>
+          <w:rFonts w:ascii="Arial" w:cs="Arial" w:eastAsia="Arial" w:hAnsi="Arial"/>
+          <w:b w:val="false"/>
+          <w:bCs w:val="false"/>
+          <w:i w:val="false"/>
+          <w:iCs w:val="false"/>
+          <w:sz w:val="22"/>
+          <w:szCs w:val="22"/>
+        </w:rPr>
+        <w:t xml:space="preserve">After the initial interview, the following improvements were identified through a review discussion and applied as v1.1 updates.</w:t>
+      </w:r>
+    </w:p>
+    <w:p>
+      <w:pPr>
+        <w:spacing w:after="40"/>
+      </w:pPr>
+      <w:r>
+        <w:rPr>
+          <w:rFonts w:ascii="Arial" w:cs="Arial" w:eastAsia="Arial" w:hAnsi="Arial"/>
+          <w:b/>
+          <w:bCs/>
+          <w:i w:val="false"/>
+          <w:iCs w:val="false"/>
+          <w:sz w:val="22"/>
+          <w:szCs w:val="22"/>
+        </w:rPr>
+        <w:t xml:space="preserve">Q: The escalation multiplier is hardcoded at 2x. If CBM finds this too aggressive or too lenient, it would require a process document revision. Should the multiplier be configurable?</w:t>
+      </w:r>
+    </w:p>
+    <w:p>
+      <w:pPr>
+        <w:spacing w:after="120"/>
+      </w:pPr>
+      <w:r>
+        <w:rPr>
+          <w:rFonts w:ascii="Arial" w:cs="Arial" w:eastAsia="Arial" w:hAnsi="Arial"/>
+          <w:b w:val="false"/>
+          <w:bCs w:val="false"/>
+          <w:i w:val="false"/>
+          <w:iCs w:val="false"/>
+          <w:sz w:val="22"/>
+          <w:szCs w:val="22"/>
+        </w:rPr>
+        <w:t xml:space="preserve">A: Yes.</w:t>
+      </w:r>
+    </w:p>
+    <w:p>
+      <w:pPr>
+        <w:spacing w:after="40"/>
+      </w:pPr>
+      <w:r>
+        <w:rPr>
+          <w:rFonts w:ascii="Arial" w:cs="Arial" w:eastAsia="Arial" w:hAnsi="Arial"/>
+          <w:b/>
+          <w:bCs/>
+          <w:i w:val="false"/>
+          <w:iCs w:val="false"/>
+          <w:sz w:val="22"/>
+          <w:szCs w:val="22"/>
+        </w:rPr>
+        <w:t xml:space="preserve">Decision: Added configurable escalation multiplier as a system variable (default 2x). Thresholds now expressed as 1x, 2x, 3x the multiplier times the cadence period. Added MN-INACTIVE-REQ-010.</w:t>
+      </w:r>
+    </w:p>
+    <w:p>
+      <w:pPr>
+        <w:spacing w:after="40"/>
+      </w:pPr>
+      <w:r>
+        <w:rPr>
+          <w:rFonts w:ascii="Arial" w:cs="Arial" w:eastAsia="Arial" w:hAnsi="Arial"/>
+          <w:b/>
+          <w:bCs/>
+          <w:i w:val="false"/>
+          <w:iCs w:val="false"/>
+          <w:sz w:val="22"/>
+          <w:szCs w:val="22"/>
+        </w:rPr>
+        <w:t xml:space="preserve">Q: The Dormant and Inactive notifications are identical in content. Should the Inactive notification carry a stronger tone or different formatting?</w:t>
+      </w:r>
+    </w:p>
+    <w:p>
+      <w:pPr>
+        <w:spacing w:after="120"/>
+      </w:pPr>
+      <w:r>
+        <w:rPr>
+          <w:rFonts w:ascii="Arial" w:cs="Arial" w:eastAsia="Arial" w:hAnsi="Arial"/>
+          <w:b w:val="false"/>
+          <w:bCs w:val="false"/>
+          <w:i w:val="false"/>
+          <w:iCs w:val="false"/>
+          <w:sz w:val="22"/>
+          <w:szCs w:val="22"/>
+        </w:rPr>
+        <w:t xml:space="preserve">A: We didn’t discuss the process of sending email notifications. There should be two templates — one for Dormant and one for Inactive. That would allow the Inactive one to have a different look.</w:t>
+      </w:r>
+    </w:p>
+    <w:p>
+      <w:pPr>
+        <w:spacing w:after="40"/>
+      </w:pPr>
+      <w:r>
+        <w:rPr>
+          <w:rFonts w:ascii="Arial" w:cs="Arial" w:eastAsia="Arial" w:hAnsi="Arial"/>
+          <w:b/>
+          <w:bCs/>
+          <w:i w:val="false"/>
+          <w:iCs w:val="false"/>
+          <w:sz w:val="22"/>
+          <w:szCs w:val="22"/>
+        </w:rPr>
+        <w:t xml:space="preserve">Q: What should the notification templates include?</w:t>
+      </w:r>
+    </w:p>
+    <w:p>
+      <w:pPr>
+        <w:spacing w:after="120"/>
+      </w:pPr>
+      <w:r>
+        <w:rPr>
+          <w:rFonts w:ascii="Arial" w:cs="Arial" w:eastAsia="Arial" w:hAnsi="Arial"/>
+          <w:b w:val="false"/>
+          <w:bCs w:val="false"/>
+          <w:i w:val="false"/>
+          <w:iCs w:val="false"/>
+          <w:sz w:val="22"/>
+          <w:szCs w:val="22"/>
+        </w:rPr>
+        <w:t xml:space="preserve">A: The notification name along with the link to the Engagement record.</w:t>
+      </w:r>
+    </w:p>
+    <w:p>
+      <w:pPr>
+        <w:spacing w:after="40"/>
+      </w:pPr>
+      <w:r>
+        <w:rPr>
+          <w:rFonts w:ascii="Arial" w:cs="Arial" w:eastAsia="Arial" w:hAnsi="Arial"/>
+          <w:b/>
+          <w:bCs/>
+          <w:i w:val="false"/>
+          <w:iCs w:val="false"/>
+          <w:sz w:val="22"/>
+          <w:szCs w:val="22"/>
+        </w:rPr>
+        <w:t xml:space="preserve">Decision: Added two configurable notification templates (Dormant and Inactive) as MN-INACTIVE-REQ-011. Each includes the stage name and a direct link to the Engagement record.</w:t>
+      </w:r>
+    </w:p>
+    <w:p>
+      <w:pPr>
+        <w:spacing w:after="40"/>
+      </w:pPr>
+      <w:r>
+        <w:rPr>
+          <w:rFonts w:ascii="Arial" w:cs="Arial" w:eastAsia="Arial" w:hAnsi="Arial"/>
+          <w:b/>
+          <w:bCs/>
+          <w:i w:val="false"/>
+          <w:iCs w:val="false"/>
+          <w:sz w:val="22"/>
+          <w:szCs w:val="22"/>
+        </w:rPr>
+        <w:t xml:space="preserve">Q: Should there be a dashboard showing engagement health at a glance?</w:t>
+      </w:r>
+    </w:p>
+    <w:p>
+      <w:pPr>
+        <w:spacing w:after="120"/>
+      </w:pPr>
+      <w:r>
+        <w:rPr>
+          <w:rFonts w:ascii="Arial" w:cs="Arial" w:eastAsia="Arial" w:hAnsi="Arial"/>
+          <w:b w:val="false"/>
+          <w:bCs w:val="false"/>
+          <w:i w:val="false"/>
+          <w:iCs w:val="false"/>
+          <w:sz w:val="22"/>
+          <w:szCs w:val="22"/>
+        </w:rPr>
+        <w:t xml:space="preserve">A: Yes. An Engagement Health dashboard would be a very useful tool. It should also show the number submitted and number awaiting acceptance by the mentor.</w:t>
+      </w:r>
+    </w:p>
+    <w:p>
+      <w:pPr>
+        <w:spacing w:after="40"/>
+      </w:pPr>
+      <w:r>
+        <w:rPr>
+          <w:rFonts w:ascii="Arial" w:cs="Arial" w:eastAsia="Arial" w:hAnsi="Arial"/>
+          <w:b/>
+          <w:bCs/>
+          <w:i w:val="false"/>
+          <w:iCs w:val="false"/>
+          <w:sz w:val="22"/>
+          <w:szCs w:val="22"/>
+        </w:rPr>
+        <w:t xml:space="preserve">Q: Who should have access to the dashboard?</w:t>
+      </w:r>
+    </w:p>
+    <w:p>
+      <w:pPr>
+        <w:spacing w:after="120"/>
+      </w:pPr>
+      <w:r>
+        <w:rPr>
+          <w:rFonts w:ascii="Arial" w:cs="Arial" w:eastAsia="Arial" w:hAnsi="Arial"/>
+          <w:b w:val="false"/>
+          <w:bCs w:val="false"/>
+          <w:i w:val="false"/>
+          <w:iCs w:val="false"/>
+          <w:sz w:val="22"/>
+          <w:szCs w:val="22"/>
+        </w:rPr>
+        <w:t xml:space="preserve">A: The admins and the board. Executive Member is already defined in the Master PRD as MST-PER-002.</w:t>
+      </w:r>
+    </w:p>
+    <w:p>
+      <w:pPr>
+        <w:spacing w:after="40"/>
+      </w:pPr>
+      <w:r>
+        <w:rPr>
+          <w:rFonts w:ascii="Arial" w:cs="Arial" w:eastAsia="Arial" w:hAnsi="Arial"/>
+          <w:b/>
+          <w:bCs/>
+          <w:i w:val="false"/>
+          <w:iCs w:val="false"/>
+          <w:sz w:val="22"/>
+          <w:szCs w:val="22"/>
+        </w:rPr>
+        <w:t xml:space="preserve">Decision: Added Engagement Health dashboard showing pipeline status counts (Submitted, Pending Acceptance, Assigned, Active, On-Hold, Dormant, Inactive) as MN-INACTIVE-REQ-012. Accessible to Client Administrator, Mentor Administrator, and Executive Member. Added Executive Member (MST-PER-002) to Section 3 Personas.</w:t>
       </w:r>
     </w:p>
     <w:sectPr>

</xml_diff>